<commit_message>
Improved testing Folder Structure
</commit_message>
<xml_diff>
--- a/6.Testing evidence/Testing documentation.docx
+++ b/6.Testing evidence/Testing documentation.docx
@@ -3,30 +3,701 @@
 <w:document xmlns:wpc="http://schemas.microsoft.com/office/word/2010/wordprocessingCanvas" xmlns:cx="http://schemas.microsoft.com/office/drawing/2014/chartex" xmlns:cx1="http://schemas.microsoft.com/office/drawing/2015/9/8/chartex" xmlns:cx2="http://schemas.microsoft.com/office/drawing/2015/10/21/chartex" xmlns:cx3="http://schemas.microsoft.com/office/drawing/2016/5/9/chartex" xmlns:cx4="http://schemas.microsoft.com/office/drawing/2016/5/10/chartex" xmlns:cx5="http://schemas.microsoft.com/office/drawing/2016/5/11/chartex" xmlns:cx6="http://schemas.microsoft.com/office/drawing/2016/5/12/chartex" xmlns:cx7="http://schemas.microsoft.com/office/drawing/2016/5/13/chartex" xmlns:cx8="http://schemas.microsoft.com/office/drawing/2016/5/14/chartex" xmlns:mc="http://schemas.openxmlformats.org/markup-compatibility/2006" xmlns:aink="http://schemas.microsoft.com/office/drawing/2016/ink" xmlns:am3d="http://schemas.microsoft.com/office/drawing/2017/model3d" xmlns:o="urn:schemas-microsoft-com:office:office" xmlns:oel="http://schemas.microsoft.com/office/2019/extlst" xmlns:r="http://schemas.openxmlformats.org/officeDocument/2006/relationships" xmlns:m="http://schemas.openxmlformats.org/officeDocument/2006/math" xmlns:v="urn:schemas-microsoft-com:vml" xmlns:wp14="http://schemas.microsoft.com/office/word/2010/wordprocessingDrawing" xmlns:wp="http://schemas.openxmlformats.org/drawingml/2006/wordprocessingDrawing" xmlns:w10="urn:schemas-microsoft-com:office:word" xmlns:w="http://schemas.openxmlformats.org/wordprocessingml/2006/main" xmlns:w14="http://schemas.microsoft.com/office/word/2010/wordml" xmlns:w15="http://schemas.microsoft.com/office/word/2012/wordml" xmlns:w16cex="http://schemas.microsoft.com/office/word/2018/wordml/cex" xmlns:w16cid="http://schemas.microsoft.com/office/word/2016/wordml/cid" xmlns:w16="http://schemas.microsoft.com/office/word/2018/wordml" xmlns:w16du="http://schemas.microsoft.com/office/word/2023/wordml/word16du" xmlns:w16sdtdh="http://schemas.microsoft.com/office/word/2020/wordml/sdtdatahash" xmlns:w16sdtfl="http://schemas.microsoft.com/office/word/2024/wordml/sdtformatlock" xmlns:w16se="http://schemas.microsoft.com/office/word/2015/wordml/symex" xmlns:wpg="http://schemas.microsoft.com/office/word/2010/wordprocessingGroup" xmlns:wpi="http://schemas.microsoft.com/office/word/2010/wordprocessingInk" xmlns:wne="http://schemas.microsoft.com/office/word/2006/wordml" xmlns:wps="http://schemas.microsoft.com/office/word/2010/wordprocessingShape" mc:Ignorable="w14 w15 w16se w16cid w16 w16cex w16sdtdh w16sdtfl w16du wp14">
   <w:body>
     <w:p>
-      <w:r>
-        <w:t>K</w:t>
-      </w:r>
-      <w:r>
-        <w:rPr>
-          <w:rFonts w:hint="eastAsia"/>
-        </w:rPr>
-        <w:t>nowed bug:</w:t>
-      </w:r>
-    </w:p>
-    <w:p>
-      <w:pPr>
-        <w:rPr>
-          <w:rFonts w:hint="eastAsia"/>
-        </w:rPr>
-      </w:pPr>
-      <w:r>
-        <w:t>Reason</w:t>
-      </w:r>
-      <w:r>
-        <w:rPr>
-          <w:rFonts w:hint="eastAsia"/>
-        </w:rPr>
-        <w:t>:</w:t>
+      <w:pPr>
+        <w:rPr>
+          <w:rFonts w:ascii="BritishRailDarkNormal" w:hAnsi="BritishRailDarkNormal" w:cs="Arial"/>
+        </w:rPr>
+      </w:pPr>
+      <w:r>
+        <w:rPr>
+          <w:rFonts w:ascii="BritishRailDarkNormal" w:hAnsi="BritishRailDarkNormal" w:cs="Arial"/>
+        </w:rPr>
+        <w:t xml:space="preserve">Group 5 – Software Engineering </w:t>
+      </w:r>
+      <w:r>
+        <w:rPr>
+          <w:rFonts w:ascii="BritishRailDarkNormal" w:hAnsi="BritishRailDarkNormal" w:cs="Arial"/>
+        </w:rPr>
+        <w:t>Project- Property</w:t>
+      </w:r>
+      <w:r>
+        <w:rPr>
+          <w:rFonts w:ascii="BritishRailDarkNormal" w:hAnsi="BritishRailDarkNormal" w:cs="Arial"/>
+        </w:rPr>
+        <w:t xml:space="preserve"> Tycoon Testing Report</w:t>
+      </w:r>
+    </w:p>
+    <w:p>
+      <w:pPr>
+        <w:rPr>
+          <w:rFonts w:ascii="BritishRailDarkNormal" w:hAnsi="BritishRailDarkNormal" w:cs="Arial"/>
+        </w:rPr>
+      </w:pPr>
+      <w:r>
+        <w:rPr>
+          <w:rFonts w:ascii="BritishRailDarkNormal" w:hAnsi="BritishRailDarkNormal" w:cs="Arial"/>
+        </w:rPr>
+        <w:t xml:space="preserve">Date: </w:t>
+      </w:r>
+      <w:r>
+        <w:rPr>
+          <w:rFonts w:ascii="BritishRailDarkNormal" w:hAnsi="BritishRailDarkNormal" w:cs="Arial"/>
+        </w:rPr>
+        <w:t>04/</w:t>
+      </w:r>
+      <w:r>
+        <w:rPr>
+          <w:rFonts w:ascii="BritishRailDarkNormal" w:hAnsi="BritishRailDarkNormal" w:cs="Arial"/>
+        </w:rPr>
+        <w:t>04/2025</w:t>
+      </w:r>
+    </w:p>
+    <w:p>
+      <w:pPr>
+        <w:rPr>
+          <w:rFonts w:ascii="BritishRailDarkNormal" w:hAnsi="BritishRailDarkNormal" w:cs="Arial"/>
+        </w:rPr>
+      </w:pPr>
+      <w:r>
+        <w:rPr>
+          <w:rFonts w:ascii="BritishRailDarkNormal" w:hAnsi="BritishRailDarkNormal" w:cs="Arial"/>
+        </w:rPr>
+        <w:t xml:space="preserve">We have </w:t>
+      </w:r>
+      <w:r>
+        <w:rPr>
+          <w:rFonts w:ascii="BritishRailDarkNormal" w:hAnsi="BritishRailDarkNormal" w:cs="Arial"/>
+        </w:rPr>
+        <w:t>tested</w:t>
+      </w:r>
+      <w:r>
+        <w:rPr>
+          <w:rFonts w:ascii="BritishRailDarkNormal" w:hAnsi="BritishRailDarkNormal" w:cs="Arial"/>
+        </w:rPr>
+        <w:t xml:space="preserve"> our game and the code in </w:t>
+      </w:r>
+      <w:r>
+        <w:rPr>
+          <w:rFonts w:ascii="BritishRailDarkNormal" w:hAnsi="BritishRailDarkNormal" w:cs="Arial"/>
+        </w:rPr>
+        <w:t>multiple</w:t>
+      </w:r>
+      <w:r>
+        <w:rPr>
+          <w:rFonts w:ascii="BritishRailDarkNormal" w:hAnsi="BritishRailDarkNormal" w:cs="Arial"/>
+        </w:rPr>
+        <w:t xml:space="preserve"> </w:t>
+      </w:r>
+      <w:r>
+        <w:rPr>
+          <w:rFonts w:ascii="BritishRailDarkNormal" w:hAnsi="BritishRailDarkNormal" w:cs="Arial"/>
+        </w:rPr>
+        <w:t>ways</w:t>
+      </w:r>
+      <w:r>
+        <w:rPr>
+          <w:rFonts w:ascii="BritishRailDarkNormal" w:hAnsi="BritishRailDarkNormal" w:cs="Arial"/>
+        </w:rPr>
+        <w:t xml:space="preserve"> to </w:t>
+      </w:r>
+      <w:r>
+        <w:rPr>
+          <w:rFonts w:ascii="BritishRailDarkNormal" w:hAnsi="BritishRailDarkNormal" w:cs="Arial"/>
+        </w:rPr>
+        <w:t>ensure</w:t>
+      </w:r>
+      <w:r>
+        <w:rPr>
+          <w:rFonts w:ascii="BritishRailDarkNormal" w:hAnsi="BritishRailDarkNormal" w:cs="Arial"/>
+        </w:rPr>
+        <w:t xml:space="preserve"> we know the most things in our game.</w:t>
+      </w:r>
+    </w:p>
+    <w:p>
+      <w:pPr>
+        <w:rPr>
+          <w:rFonts w:ascii="BritishRailDarkNormal" w:hAnsi="BritishRailDarkNormal" w:cs="Arial"/>
+        </w:rPr>
+      </w:pPr>
+      <w:r>
+        <w:rPr>
+          <w:rFonts w:ascii="BritishRailDarkNormal" w:hAnsi="BritishRailDarkNormal" w:cs="Arial"/>
+        </w:rPr>
+        <w:t xml:space="preserve">Here is </w:t>
+      </w:r>
+      <w:r>
+        <w:rPr>
+          <w:rFonts w:ascii="BritishRailDarkNormal" w:hAnsi="BritishRailDarkNormal" w:cs="Arial"/>
+        </w:rPr>
+        <w:t>the</w:t>
+      </w:r>
+      <w:r>
+        <w:rPr>
+          <w:rFonts w:ascii="BritishRailDarkNormal" w:hAnsi="BritishRailDarkNormal" w:cs="Arial"/>
+        </w:rPr>
+        <w:t xml:space="preserve"> test we used to test and the </w:t>
+      </w:r>
+      <w:r>
+        <w:rPr>
+          <w:rFonts w:ascii="BritishRailDarkNormal" w:hAnsi="BritishRailDarkNormal" w:cs="Arial"/>
+        </w:rPr>
+        <w:t>result:</w:t>
+      </w:r>
+    </w:p>
+    <w:p>
+      <w:pPr>
+        <w:pStyle w:val="a9"/>
+        <w:numPr>
+          <w:ilvl w:val="0"/>
+          <w:numId w:val="1"/>
+        </w:numPr>
+        <w:rPr>
+          <w:rFonts w:ascii="BritishRailDarkNormal" w:hAnsi="BritishRailDarkNormal" w:cs="Arial"/>
+        </w:rPr>
+      </w:pPr>
+      <w:r>
+        <w:rPr>
+          <w:rFonts w:ascii="BritishRailDarkNormal" w:hAnsi="BritishRailDarkNormal" w:cs="Arial"/>
+        </w:rPr>
+        <w:t>Unit Test:</w:t>
+      </w:r>
+    </w:p>
+    <w:p>
+      <w:pPr>
+        <w:pStyle w:val="a9"/>
+        <w:ind w:left="480"/>
+        <w:rPr>
+          <w:rFonts w:ascii="BritishRailDarkNormal" w:hAnsi="BritishRailDarkNormal" w:cs="Arial"/>
+        </w:rPr>
+      </w:pPr>
+      <w:r>
+        <w:rPr>
+          <w:rFonts w:ascii="BritishRailDarkNormal" w:hAnsi="BritishRailDarkNormal" w:cs="Arial"/>
+        </w:rPr>
+        <w:t>Edge cases</w:t>
+      </w:r>
+    </w:p>
+    <w:p>
+      <w:pPr>
+        <w:pStyle w:val="a9"/>
+        <w:ind w:left="480"/>
+        <w:rPr>
+          <w:rFonts w:ascii="BritishRailDarkNormal" w:hAnsi="BritishRailDarkNormal" w:cs="Arial"/>
+        </w:rPr>
+      </w:pPr>
+      <w:r>
+        <w:rPr>
+          <w:rFonts w:ascii="BritishRailDarkNormal" w:hAnsi="BritishRailDarkNormal" w:cs="Arial"/>
+        </w:rPr>
+        <w:t>However,</w:t>
+      </w:r>
+      <w:r>
+        <w:rPr>
+          <w:rFonts w:ascii="BritishRailDarkNormal" w:hAnsi="BritishRailDarkNormal" w:cs="Arial"/>
+        </w:rPr>
+        <w:t xml:space="preserve"> because we had a plan and considered avoiding it at the beginning when we did coding, we didn't find many</w:t>
+      </w:r>
+      <w:r>
+        <w:rPr>
+          <w:rFonts w:ascii="BritishRailDarkNormal" w:hAnsi="BritishRailDarkNormal" w:cs="Arial"/>
+        </w:rPr>
+        <w:t xml:space="preserve"> edge cases that </w:t>
+      </w:r>
+      <w:r>
+        <w:rPr>
+          <w:rFonts w:ascii="BritishRailDarkNormal" w:hAnsi="BritishRailDarkNormal" w:cs="Arial"/>
+        </w:rPr>
+        <w:t>would</w:t>
+      </w:r>
+      <w:r>
+        <w:rPr>
+          <w:rFonts w:ascii="BritishRailDarkNormal" w:hAnsi="BritishRailDarkNormal" w:cs="Arial"/>
+        </w:rPr>
+        <w:t xml:space="preserve"> make our </w:t>
+      </w:r>
+      <w:r>
+        <w:rPr>
+          <w:rFonts w:ascii="BritishRailDarkNormal" w:hAnsi="BritishRailDarkNormal" w:cs="Arial"/>
+        </w:rPr>
+        <w:t>game</w:t>
+      </w:r>
+      <w:r>
+        <w:rPr>
+          <w:rFonts w:ascii="BritishRailDarkNormal" w:hAnsi="BritishRailDarkNormal" w:cs="Arial"/>
+        </w:rPr>
+        <w:t xml:space="preserve"> bug in </w:t>
+      </w:r>
+      <w:r>
+        <w:rPr>
+          <w:rFonts w:ascii="BritishRailDarkNormal" w:hAnsi="BritishRailDarkNormal" w:cs="Arial"/>
+        </w:rPr>
+        <w:t xml:space="preserve">the </w:t>
+      </w:r>
+      <w:r>
+        <w:rPr>
+          <w:rFonts w:ascii="BritishRailDarkNormal" w:hAnsi="BritishRailDarkNormal" w:cs="Arial"/>
+        </w:rPr>
+        <w:t xml:space="preserve">unit test with 32 test </w:t>
+      </w:r>
+      <w:r>
+        <w:rPr>
+          <w:rFonts w:ascii="BritishRailDarkNormal" w:hAnsi="BritishRailDarkNormal" w:cs="Arial"/>
+        </w:rPr>
+        <w:t>cases</w:t>
+      </w:r>
+      <w:r>
+        <w:rPr>
+          <w:rFonts w:ascii="BritishRailDarkNormal" w:hAnsi="BritishRailDarkNormal" w:cs="Arial"/>
+        </w:rPr>
+        <w:t>.</w:t>
+      </w:r>
+    </w:p>
+    <w:p>
+      <w:pPr>
+        <w:pStyle w:val="a9"/>
+        <w:ind w:left="480"/>
+        <w:rPr>
+          <w:rFonts w:ascii="BritishRailDarkNormal" w:hAnsi="BritishRailDarkNormal" w:cs="Arial"/>
+        </w:rPr>
+      </w:pPr>
+    </w:p>
+    <w:p>
+      <w:pPr>
+        <w:pStyle w:val="a9"/>
+        <w:numPr>
+          <w:ilvl w:val="0"/>
+          <w:numId w:val="1"/>
+        </w:numPr>
+        <w:rPr>
+          <w:rFonts w:ascii="BritishRailDarkNormal" w:hAnsi="BritishRailDarkNormal" w:cs="Arial"/>
+        </w:rPr>
+      </w:pPr>
+      <w:r>
+        <w:rPr>
+          <w:rFonts w:ascii="BritishRailDarkNormal" w:hAnsi="BritishRailDarkNormal" w:cs="Arial"/>
+        </w:rPr>
+        <w:t>Level testing:</w:t>
+      </w:r>
+    </w:p>
+    <w:p>
+      <w:pPr>
+        <w:pStyle w:val="a9"/>
+        <w:ind w:left="480"/>
+        <w:rPr>
+          <w:rFonts w:ascii="BritishRailDarkNormal" w:hAnsi="BritishRailDarkNormal" w:cs="Arial"/>
+        </w:rPr>
+      </w:pPr>
+      <w:r>
+        <w:rPr>
+          <w:rFonts w:ascii="BritishRailDarkNormal" w:hAnsi="BritishRailDarkNormal" w:cs="Arial"/>
+        </w:rPr>
+        <w:t xml:space="preserve">We do find some </w:t>
+      </w:r>
+      <w:r>
+        <w:rPr>
+          <w:rFonts w:ascii="BritishRailDarkNormal" w:hAnsi="BritishRailDarkNormal" w:cs="Arial"/>
+        </w:rPr>
+        <w:t>bugs</w:t>
+      </w:r>
+      <w:r>
+        <w:rPr>
+          <w:rFonts w:ascii="BritishRailDarkNormal" w:hAnsi="BritishRailDarkNormal" w:cs="Arial"/>
+        </w:rPr>
+        <w:t xml:space="preserve"> here</w:t>
+      </w:r>
+    </w:p>
+    <w:p>
+      <w:pPr>
+        <w:pStyle w:val="a9"/>
+        <w:ind w:left="480"/>
+        <w:rPr>
+          <w:rFonts w:ascii="BritishRailDarkNormal" w:hAnsi="BritishRailDarkNormal" w:cs="Arial" w:hint="eastAsia"/>
+        </w:rPr>
+      </w:pPr>
+      <w:r>
+        <w:rPr>
+          <w:rFonts w:ascii="BritishRailDarkNormal" w:hAnsi="BritishRailDarkNormal" w:cs="Arial" w:hint="eastAsia"/>
+        </w:rPr>
+        <w:t xml:space="preserve">We have created 2 </w:t>
+      </w:r>
+      <w:r>
+        <w:rPr>
+          <w:rFonts w:ascii="BritishRailDarkNormal" w:hAnsi="BritishRailDarkNormal" w:cs="Arial"/>
+        </w:rPr>
+        <w:t>Level testing</w:t>
+      </w:r>
+      <w:r>
+        <w:rPr>
+          <w:rFonts w:ascii="BritishRailDarkNormal" w:hAnsi="BritishRailDarkNormal" w:cs="Arial" w:hint="eastAsia"/>
+        </w:rPr>
+        <w:t xml:space="preserve"> Doc</w:t>
+      </w:r>
+    </w:p>
+    <w:p>
+      <w:pPr>
+        <w:pStyle w:val="a9"/>
+        <w:ind w:left="480"/>
+        <w:rPr>
+          <w:rFonts w:ascii="BritishRailDarkNormal" w:hAnsi="BritishRailDarkNormal" w:cs="Arial"/>
+        </w:rPr>
+      </w:pPr>
+    </w:p>
+    <w:p>
+      <w:pPr>
+        <w:pStyle w:val="a9"/>
+        <w:numPr>
+          <w:ilvl w:val="0"/>
+          <w:numId w:val="1"/>
+        </w:numPr>
+        <w:rPr>
+          <w:rFonts w:ascii="BritishRailDarkNormal" w:hAnsi="BritishRailDarkNormal" w:cs="Arial"/>
+        </w:rPr>
+      </w:pPr>
+      <w:r>
+        <w:rPr>
+          <w:rFonts w:ascii="BritishRailDarkNormal" w:hAnsi="BritishRailDarkNormal" w:cs="Arial"/>
+        </w:rPr>
+        <w:t>Game play Testing Debug log:</w:t>
+      </w:r>
+    </w:p>
+    <w:p>
+      <w:pPr>
+        <w:pStyle w:val="a9"/>
+        <w:ind w:left="480"/>
+        <w:rPr>
+          <w:rFonts w:ascii="BritishRailDarkNormal" w:hAnsi="BritishRailDarkNormal" w:cs="Arial"/>
+        </w:rPr>
+      </w:pPr>
+      <w:r>
+        <w:rPr>
+          <w:rFonts w:ascii="BritishRailDarkNormal" w:hAnsi="BritishRailDarkNormal" w:cs="Arial"/>
+        </w:rPr>
+        <w:t>Added</w:t>
+      </w:r>
+      <w:r>
+        <w:rPr>
+          <w:rFonts w:ascii="BritishRailDarkNormal" w:hAnsi="BritishRailDarkNormal" w:cs="Arial"/>
+        </w:rPr>
+        <w:t xml:space="preserve"> a lot of debug print </w:t>
+      </w:r>
+      <w:r>
+        <w:rPr>
+          <w:rFonts w:ascii="BritishRailDarkNormal" w:hAnsi="BritishRailDarkNormal" w:cs="Arial"/>
+        </w:rPr>
+        <w:t>into</w:t>
+      </w:r>
+      <w:r>
+        <w:rPr>
+          <w:rFonts w:ascii="BritishRailDarkNormal" w:hAnsi="BritishRailDarkNormal" w:cs="Arial"/>
+        </w:rPr>
+        <w:t xml:space="preserve"> the game</w:t>
+      </w:r>
+      <w:r>
+        <w:rPr>
+          <w:rFonts w:ascii="BritishRailDarkNormal" w:hAnsi="BritishRailDarkNormal" w:cs="Arial"/>
+        </w:rPr>
+        <w:t xml:space="preserve"> </w:t>
+      </w:r>
+      <w:r>
+        <w:rPr>
+          <w:rFonts w:ascii="BritishRailDarkNormal" w:hAnsi="BritishRailDarkNormal" w:cs="Arial"/>
+        </w:rPr>
+        <w:t xml:space="preserve">by looking at the game progress to find </w:t>
+      </w:r>
+      <w:r>
+        <w:rPr>
+          <w:rFonts w:ascii="BritishRailDarkNormal" w:hAnsi="BritishRailDarkNormal" w:cs="Arial"/>
+        </w:rPr>
+        <w:t>bugs</w:t>
+      </w:r>
+    </w:p>
+    <w:p>
+      <w:pPr>
+        <w:pStyle w:val="a9"/>
+        <w:ind w:left="480"/>
+        <w:rPr>
+          <w:rFonts w:ascii="BritishRailDarkNormal" w:hAnsi="BritishRailDarkNormal" w:cs="Arial"/>
+        </w:rPr>
+      </w:pPr>
+      <w:r>
+        <w:rPr>
+          <w:rFonts w:ascii="BritishRailDarkNormal" w:hAnsi="BritishRailDarkNormal" w:cs="Arial"/>
+        </w:rPr>
+        <w:t>found</w:t>
+      </w:r>
+      <w:r>
+        <w:rPr>
+          <w:rFonts w:ascii="BritishRailDarkNormal" w:hAnsi="BritishRailDarkNormal" w:cs="Arial"/>
+        </w:rPr>
+        <w:t xml:space="preserve"> in game play:</w:t>
+      </w:r>
+    </w:p>
+    <w:p>
+      <w:pPr>
+        <w:pStyle w:val="a9"/>
+        <w:ind w:left="480"/>
+        <w:rPr>
+          <w:rFonts w:ascii="BritishRailDarkNormal" w:hAnsi="BritishRailDarkNormal" w:cs="Arial"/>
+        </w:rPr>
+      </w:pPr>
+      <w:r>
+        <w:rPr>
+          <w:rFonts w:ascii="BritishRailDarkNormal" w:hAnsi="BritishRailDarkNormal" w:cs="Arial"/>
+        </w:rPr>
+        <w:t>Known</w:t>
+      </w:r>
+      <w:r>
+        <w:rPr>
+          <w:rFonts w:ascii="BritishRailDarkNormal" w:hAnsi="BritishRailDarkNormal" w:cs="Arial"/>
+        </w:rPr>
+        <w:t xml:space="preserve"> bug:</w:t>
+      </w:r>
+    </w:p>
+    <w:p>
+      <w:pPr>
+        <w:pStyle w:val="a9"/>
+        <w:ind w:left="480"/>
+        <w:rPr>
+          <w:rFonts w:ascii="BritishRailDarkNormal" w:hAnsi="BritishRailDarkNormal" w:cs="Arial"/>
+        </w:rPr>
+      </w:pPr>
+      <w:r>
+        <w:rPr>
+          <w:rFonts w:ascii="BritishRailDarkNormal" w:hAnsi="BritishRailDarkNormal" w:cs="Arial"/>
+        </w:rPr>
+        <w:t>Reason:</w:t>
+      </w:r>
+    </w:p>
+    <w:p>
+      <w:pPr>
+        <w:rPr>
+          <w:rFonts w:ascii="BritishRailDarkNormal" w:hAnsi="BritishRailDarkNormal" w:cs="Arial"/>
+        </w:rPr>
+      </w:pPr>
+    </w:p>
+    <w:p>
+      <w:pPr>
+        <w:pStyle w:val="a9"/>
+        <w:numPr>
+          <w:ilvl w:val="0"/>
+          <w:numId w:val="1"/>
+        </w:numPr>
+        <w:rPr>
+          <w:rFonts w:ascii="BritishRailDarkNormal" w:hAnsi="BritishRailDarkNormal" w:cs="Arial"/>
+        </w:rPr>
+      </w:pPr>
+      <w:r>
+        <w:rPr>
+          <w:rFonts w:ascii="BritishRailDarkNormal" w:hAnsi="BritishRailDarkNormal" w:cs="Arial"/>
+        </w:rPr>
+        <w:t>Semantic and stylistic Test with Lint:</w:t>
+      </w:r>
+    </w:p>
+    <w:p>
+      <w:pPr>
+        <w:pStyle w:val="a9"/>
+        <w:ind w:left="480"/>
+        <w:rPr>
+          <w:rFonts w:ascii="BritishRailDarkNormal" w:hAnsi="BritishRailDarkNormal" w:cs="Arial"/>
+        </w:rPr>
+      </w:pPr>
+      <w:hyperlink r:id="rId7" w:history="1">
+        <w:r>
+          <w:rPr>
+            <w:rStyle w:val="ae"/>
+            <w:rFonts w:ascii="BritishRailDarkNormal" w:hAnsi="BritishRailDarkNormal" w:cs="Arial"/>
+          </w:rPr>
+          <w:t>https://en.wikipedia.org/wiki/Static_program_analysis</w:t>
+        </w:r>
+      </w:hyperlink>
+    </w:p>
+    <w:p>
+      <w:pPr>
+        <w:pStyle w:val="a9"/>
+        <w:ind w:left="480"/>
+        <w:rPr>
+          <w:rFonts w:ascii="BritishRailDarkNormal" w:hAnsi="BritishRailDarkNormal" w:cs="Arial"/>
+        </w:rPr>
+      </w:pPr>
+      <w:hyperlink r:id="rId8" w:history="1">
+        <w:r>
+          <w:rPr>
+            <w:rStyle w:val="ae"/>
+            <w:rFonts w:ascii="BritishRailDarkNormal" w:hAnsi="BritishRailDarkNormal" w:cs="Arial"/>
+          </w:rPr>
+          <w:t>https://en.wikipedia.org/wiki/Lint_(software)</w:t>
+        </w:r>
+      </w:hyperlink>
+    </w:p>
+    <w:p>
+      <w:pPr>
+        <w:pStyle w:val="a9"/>
+        <w:ind w:left="480"/>
+        <w:rPr>
+          <w:rFonts w:ascii="BritishRailDarkNormal" w:hAnsi="BritishRailDarkNormal" w:cs="Arial"/>
+        </w:rPr>
+      </w:pPr>
+    </w:p>
+    <w:p>
+      <w:pPr>
+        <w:pStyle w:val="a9"/>
+        <w:ind w:left="480"/>
+        <w:rPr>
+          <w:rFonts w:ascii="BritishRailDarkNormal" w:hAnsi="BritishRailDarkNormal" w:cs="Arial"/>
+        </w:rPr>
+      </w:pPr>
+      <w:r>
+        <w:rPr>
+          <w:rFonts w:ascii="BritishRailDarkNormal" w:hAnsi="BritishRailDarkNormal" w:cs="Arial"/>
+        </w:rPr>
+        <w:t>PEP 8 style guidelines and avoids common coding mistakes.</w:t>
+      </w:r>
+    </w:p>
+    <w:p>
+      <w:pPr>
+        <w:pStyle w:val="a9"/>
+        <w:ind w:left="480"/>
+        <w:rPr>
+          <w:rFonts w:ascii="BritishRailDarkNormal" w:hAnsi="BritishRailDarkNormal" w:cs="Arial"/>
+        </w:rPr>
+      </w:pPr>
+      <w:r>
+        <w:rPr>
+          <w:rFonts w:ascii="BritishRailDarkNormal" w:hAnsi="BritishRailDarkNormal" w:cs="Arial"/>
+        </w:rPr>
+        <w:t>https://docs.github.com/en/actions/use-cases-and-examples/building-and-testing/building-and-testing-python</w:t>
+      </w:r>
+    </w:p>
+    <w:p>
+      <w:pPr>
+        <w:pStyle w:val="a9"/>
+        <w:ind w:left="480"/>
+        <w:rPr>
+          <w:rFonts w:ascii="BritishRailDarkNormal" w:hAnsi="BritishRailDarkNormal" w:cs="Arial"/>
+        </w:rPr>
+      </w:pPr>
+    </w:p>
+    <w:p>
+      <w:pPr>
+        <w:pStyle w:val="a9"/>
+        <w:numPr>
+          <w:ilvl w:val="0"/>
+          <w:numId w:val="1"/>
+        </w:numPr>
+        <w:rPr>
+          <w:rFonts w:ascii="BritishRailDarkNormal" w:hAnsi="BritishRailDarkNormal" w:cs="Arial"/>
+        </w:rPr>
+      </w:pPr>
+      <w:r>
+        <w:rPr>
+          <w:rFonts w:ascii="BritishRailDarkNormal" w:hAnsi="BritishRailDarkNormal" w:cs="Arial"/>
+        </w:rPr>
+        <w:t>Test Code security results:</w:t>
+      </w:r>
+    </w:p>
+    <w:p>
+      <w:pPr>
+        <w:pStyle w:val="a9"/>
+        <w:ind w:left="480"/>
+        <w:rPr>
+          <w:rFonts w:ascii="BritishRailDarkNormal" w:hAnsi="BritishRailDarkNormal" w:cs="Arial"/>
+        </w:rPr>
+      </w:pPr>
+      <w:hyperlink r:id="rId9" w:tgtFrame="_blank" w:tooltip="https://github.com/PyCQA/bandit" w:history="1">
+        <w:r>
+          <w:rPr>
+            <w:rStyle w:val="ae"/>
+            <w:rFonts w:ascii="BritishRailDarkNormal" w:hAnsi="BritishRailDarkNormal" w:cs="Arial"/>
+          </w:rPr>
+          <w:t>https://github.com/PyCQA/bandit</w:t>
+        </w:r>
+      </w:hyperlink>
+      <w:r>
+        <w:rPr>
+          <w:rFonts w:ascii="BritishRailDarkNormal" w:hAnsi="BritishRailDarkNormal" w:cs="Arial"/>
+        </w:rPr>
+        <w:t xml:space="preserve">  </w:t>
+      </w:r>
+      <w:r>
+        <w:rPr>
+          <w:rFonts w:ascii="BritishRailDarkNormal" w:hAnsi="BritishRailDarkNormal" w:cs="Arial"/>
+        </w:rPr>
+        <w:t>Github</w:t>
+      </w:r>
+    </w:p>
+    <w:p>
+      <w:pPr>
+        <w:pStyle w:val="a9"/>
+        <w:ind w:left="480"/>
+        <w:rPr>
+          <w:rFonts w:ascii="BritishRailDarkNormal" w:hAnsi="BritishRailDarkNormal" w:cs="Arial"/>
+        </w:rPr>
+      </w:pPr>
+      <w:r>
+        <w:rPr>
+          <w:rFonts w:ascii="BritishRailDarkNormal" w:hAnsi="BritishRailDarkNormal" w:cs="Arial"/>
+        </w:rPr>
+        <w:t>a code scanning result (in the format of a .</w:t>
+      </w:r>
+      <w:r>
+        <w:rPr>
+          <w:rFonts w:ascii="BritishRailDarkNormal" w:hAnsi="BritishRailDarkNormal" w:cs="Arial"/>
+        </w:rPr>
+        <w:t xml:space="preserve"> </w:t>
+      </w:r>
+      <w:r>
+        <w:rPr>
+          <w:rFonts w:ascii="BritishRailDarkNormal" w:hAnsi="BritishRailDarkNormal" w:cs="Arial"/>
+        </w:rPr>
+        <w:t>SARIF file) using GitHub Actions.</w:t>
+      </w:r>
+    </w:p>
+    <w:p>
+      <w:pPr>
+        <w:pStyle w:val="a9"/>
+        <w:ind w:left="480"/>
+        <w:rPr>
+          <w:rFonts w:ascii="BritishRailDarkNormal" w:hAnsi="BritishRailDarkNormal" w:cs="Arial"/>
+        </w:rPr>
+      </w:pPr>
+    </w:p>
+    <w:p>
+      <w:pPr>
+        <w:pStyle w:val="a9"/>
+        <w:numPr>
+          <w:ilvl w:val="0"/>
+          <w:numId w:val="1"/>
+        </w:numPr>
+        <w:rPr>
+          <w:rFonts w:ascii="BritishRailDarkNormal" w:hAnsi="BritishRailDarkNormal" w:cs="Arial"/>
+        </w:rPr>
+      </w:pPr>
+      <w:r>
+        <w:rPr>
+          <w:rFonts w:ascii="BritishRailDarkNormal" w:hAnsi="BritishRailDarkNormal" w:cs="Arial"/>
+        </w:rPr>
+        <w:t>Continuous Integration (CI)test using GitHub Actions</w:t>
+      </w:r>
+    </w:p>
+    <w:p>
+      <w:pPr>
+        <w:pStyle w:val="a9"/>
+        <w:ind w:left="480"/>
+        <w:rPr>
+          <w:rFonts w:ascii="BritishRailDarkNormal" w:hAnsi="BritishRailDarkNormal" w:cs="Arial"/>
+        </w:rPr>
+      </w:pPr>
+      <w:r>
+        <w:rPr>
+          <w:rFonts w:ascii="BritishRailDarkNormal" w:hAnsi="BritishRailDarkNormal" w:cs="Arial"/>
+        </w:rPr>
+        <w:t xml:space="preserve">python-package.yml </w:t>
+      </w:r>
+      <w:r>
+        <w:rPr>
+          <w:rFonts w:ascii="BritishRailDarkNormal" w:hAnsi="BritishRailDarkNormal" w:cs="Arial"/>
+        </w:rPr>
+        <w:t>install Python dependencies, run tests and lint with a variety of Python versions</w:t>
       </w:r>
     </w:p>
     <w:sectPr>
@@ -37,6 +708,150 @@
     </w:sectPr>
   </w:body>
 </w:document>
+</file>
+
+<file path=word/endnotes.xml><?xml version="1.0" encoding="utf-8"?>
+<w:endnotes xmlns:wpc="http://schemas.microsoft.com/office/word/2010/wordprocessingCanvas" xmlns:cx="http://schemas.microsoft.com/office/drawing/2014/chartex" xmlns:cx1="http://schemas.microsoft.com/office/drawing/2015/9/8/chartex" xmlns:cx2="http://schemas.microsoft.com/office/drawing/2015/10/21/chartex" xmlns:cx3="http://schemas.microsoft.com/office/drawing/2016/5/9/chartex" xmlns:cx4="http://schemas.microsoft.com/office/drawing/2016/5/10/chartex" xmlns:cx5="http://schemas.microsoft.com/office/drawing/2016/5/11/chartex" xmlns:cx6="http://schemas.microsoft.com/office/drawing/2016/5/12/chartex" xmlns:cx7="http://schemas.microsoft.com/office/drawing/2016/5/13/chartex" xmlns:cx8="http://schemas.microsoft.com/office/drawing/2016/5/14/chartex" xmlns:mc="http://schemas.openxmlformats.org/markup-compatibility/2006" xmlns:aink="http://schemas.microsoft.com/office/drawing/2016/ink" xmlns:am3d="http://schemas.microsoft.com/office/drawing/2017/model3d" xmlns:o="urn:schemas-microsoft-com:office:office" xmlns:oel="http://schemas.microsoft.com/office/2019/extlst" xmlns:r="http://schemas.openxmlformats.org/officeDocument/2006/relationships" xmlns:m="http://schemas.openxmlformats.org/officeDocument/2006/math" xmlns:v="urn:schemas-microsoft-com:vml" xmlns:wp14="http://schemas.microsoft.com/office/word/2010/wordprocessingDrawing" xmlns:wp="http://schemas.openxmlformats.org/drawingml/2006/wordprocessingDrawing" xmlns:w10="urn:schemas-microsoft-com:office:word" xmlns:w="http://schemas.openxmlformats.org/wordprocessingml/2006/main" xmlns:w14="http://schemas.microsoft.com/office/word/2010/wordml" xmlns:w15="http://schemas.microsoft.com/office/word/2012/wordml" xmlns:w16cex="http://schemas.microsoft.com/office/word/2018/wordml/cex" xmlns:w16cid="http://schemas.microsoft.com/office/word/2016/wordml/cid" xmlns:w16="http://schemas.microsoft.com/office/word/2018/wordml" xmlns:w16du="http://schemas.microsoft.com/office/word/2023/wordml/word16du" xmlns:w16sdtdh="http://schemas.microsoft.com/office/word/2020/wordml/sdtdatahash" xmlns:w16sdtfl="http://schemas.microsoft.com/office/word/2024/wordml/sdtformatlock" xmlns:w16se="http://schemas.microsoft.com/office/word/2015/wordml/symex" xmlns:wpg="http://schemas.microsoft.com/office/word/2010/wordprocessingGroup" xmlns:wpi="http://schemas.microsoft.com/office/word/2010/wordprocessingInk" xmlns:wne="http://schemas.microsoft.com/office/word/2006/wordml" xmlns:wps="http://schemas.microsoft.com/office/word/2010/wordprocessingShape" mc:Ignorable="w14 w15 w16se w16cid w16 w16cex w16sdtdh w16sdtfl w16du wp14">
+  <w:endnote w:type="separator" w:id="-1">
+    <w:p>
+      <w:pPr>
+        <w:spacing w:after="0" w:line="240" w:lineRule="auto"/>
+      </w:pPr>
+      <w:r>
+        <w:separator/>
+      </w:r>
+    </w:p>
+  </w:endnote>
+  <w:endnote w:type="continuationSeparator" w:id="0">
+    <w:p>
+      <w:pPr>
+        <w:spacing w:after="0" w:line="240" w:lineRule="auto"/>
+      </w:pPr>
+      <w:r>
+        <w:continuationSeparator/>
+      </w:r>
+    </w:p>
+  </w:endnote>
+</w:endnotes>
+</file>
+
+<file path=word/footnotes.xml><?xml version="1.0" encoding="utf-8"?>
+<w:footnotes xmlns:wpc="http://schemas.microsoft.com/office/word/2010/wordprocessingCanvas" xmlns:cx="http://schemas.microsoft.com/office/drawing/2014/chartex" xmlns:cx1="http://schemas.microsoft.com/office/drawing/2015/9/8/chartex" xmlns:cx2="http://schemas.microsoft.com/office/drawing/2015/10/21/chartex" xmlns:cx3="http://schemas.microsoft.com/office/drawing/2016/5/9/chartex" xmlns:cx4="http://schemas.microsoft.com/office/drawing/2016/5/10/chartex" xmlns:cx5="http://schemas.microsoft.com/office/drawing/2016/5/11/chartex" xmlns:cx6="http://schemas.microsoft.com/office/drawing/2016/5/12/chartex" xmlns:cx7="http://schemas.microsoft.com/office/drawing/2016/5/13/chartex" xmlns:cx8="http://schemas.microsoft.com/office/drawing/2016/5/14/chartex" xmlns:mc="http://schemas.openxmlformats.org/markup-compatibility/2006" xmlns:aink="http://schemas.microsoft.com/office/drawing/2016/ink" xmlns:am3d="http://schemas.microsoft.com/office/drawing/2017/model3d" xmlns:o="urn:schemas-microsoft-com:office:office" xmlns:oel="http://schemas.microsoft.com/office/2019/extlst" xmlns:r="http://schemas.openxmlformats.org/officeDocument/2006/relationships" xmlns:m="http://schemas.openxmlformats.org/officeDocument/2006/math" xmlns:v="urn:schemas-microsoft-com:vml" xmlns:wp14="http://schemas.microsoft.com/office/word/2010/wordprocessingDrawing" xmlns:wp="http://schemas.openxmlformats.org/drawingml/2006/wordprocessingDrawing" xmlns:w10="urn:schemas-microsoft-com:office:word" xmlns:w="http://schemas.openxmlformats.org/wordprocessingml/2006/main" xmlns:w14="http://schemas.microsoft.com/office/word/2010/wordml" xmlns:w15="http://schemas.microsoft.com/office/word/2012/wordml" xmlns:w16cex="http://schemas.microsoft.com/office/word/2018/wordml/cex" xmlns:w16cid="http://schemas.microsoft.com/office/word/2016/wordml/cid" xmlns:w16="http://schemas.microsoft.com/office/word/2018/wordml" xmlns:w16du="http://schemas.microsoft.com/office/word/2023/wordml/word16du" xmlns:w16sdtdh="http://schemas.microsoft.com/office/word/2020/wordml/sdtdatahash" xmlns:w16sdtfl="http://schemas.microsoft.com/office/word/2024/wordml/sdtformatlock" xmlns:w16se="http://schemas.microsoft.com/office/word/2015/wordml/symex" xmlns:wpg="http://schemas.microsoft.com/office/word/2010/wordprocessingGroup" xmlns:wpi="http://schemas.microsoft.com/office/word/2010/wordprocessingInk" xmlns:wne="http://schemas.microsoft.com/office/word/2006/wordml" xmlns:wps="http://schemas.microsoft.com/office/word/2010/wordprocessingShape" mc:Ignorable="w14 w15 w16se w16cid w16 w16cex w16sdtdh w16sdtfl w16du wp14">
+  <w:footnote w:type="separator" w:id="-1">
+    <w:p>
+      <w:pPr>
+        <w:spacing w:after="0" w:line="240" w:lineRule="auto"/>
+      </w:pPr>
+      <w:r>
+        <w:separator/>
+      </w:r>
+    </w:p>
+  </w:footnote>
+  <w:footnote w:type="continuationSeparator" w:id="0">
+    <w:p>
+      <w:pPr>
+        <w:spacing w:after="0" w:line="240" w:lineRule="auto"/>
+      </w:pPr>
+      <w:r>
+        <w:continuationSeparator/>
+      </w:r>
+    </w:p>
+  </w:footnote>
+</w:footnotes>
+</file>
+
+<file path=word/numbering.xml><?xml version="1.0" encoding="utf-8"?>
+<w:numbering xmlns:wpc="http://schemas.microsoft.com/office/word/2010/wordprocessingCanvas" xmlns:cx="http://schemas.microsoft.com/office/drawing/2014/chartex" xmlns:cx1="http://schemas.microsoft.com/office/drawing/2015/9/8/chartex" xmlns:cx2="http://schemas.microsoft.com/office/drawing/2015/10/21/chartex" xmlns:cx3="http://schemas.microsoft.com/office/drawing/2016/5/9/chartex" xmlns:cx4="http://schemas.microsoft.com/office/drawing/2016/5/10/chartex" xmlns:cx5="http://schemas.microsoft.com/office/drawing/2016/5/11/chartex" xmlns:cx6="http://schemas.microsoft.com/office/drawing/2016/5/12/chartex" xmlns:cx7="http://schemas.microsoft.com/office/drawing/2016/5/13/chartex" xmlns:cx8="http://schemas.microsoft.com/office/drawing/2016/5/14/chartex" xmlns:mc="http://schemas.openxmlformats.org/markup-compatibility/2006" xmlns:aink="http://schemas.microsoft.com/office/drawing/2016/ink" xmlns:am3d="http://schemas.microsoft.com/office/drawing/2017/model3d" xmlns:o="urn:schemas-microsoft-com:office:office" xmlns:oel="http://schemas.microsoft.com/office/2019/extlst" xmlns:r="http://schemas.openxmlformats.org/officeDocument/2006/relationships" xmlns:m="http://schemas.openxmlformats.org/officeDocument/2006/math" xmlns:v="urn:schemas-microsoft-com:vml" xmlns:wp14="http://schemas.microsoft.com/office/word/2010/wordprocessingDrawing" xmlns:wp="http://schemas.openxmlformats.org/drawingml/2006/wordprocessingDrawing" xmlns:w10="urn:schemas-microsoft-com:office:word" xmlns:w="http://schemas.openxmlformats.org/wordprocessingml/2006/main" xmlns:w14="http://schemas.microsoft.com/office/word/2010/wordml" xmlns:w15="http://schemas.microsoft.com/office/word/2012/wordml" xmlns:w16cex="http://schemas.microsoft.com/office/word/2018/wordml/cex" xmlns:w16cid="http://schemas.microsoft.com/office/word/2016/wordml/cid" xmlns:w16="http://schemas.microsoft.com/office/word/2018/wordml" xmlns:w16du="http://schemas.microsoft.com/office/word/2023/wordml/word16du" xmlns:w16sdtdh="http://schemas.microsoft.com/office/word/2020/wordml/sdtdatahash" xmlns:w16sdtfl="http://schemas.microsoft.com/office/word/2024/wordml/sdtformatlock" xmlns:w16se="http://schemas.microsoft.com/office/word/2015/wordml/symex" xmlns:wpg="http://schemas.microsoft.com/office/word/2010/wordprocessingGroup" xmlns:wpi="http://schemas.microsoft.com/office/word/2010/wordprocessingInk" xmlns:wne="http://schemas.microsoft.com/office/word/2006/wordml" xmlns:wps="http://schemas.microsoft.com/office/word/2010/wordprocessingShape" mc:Ignorable="w14 w15 w16se w16cid w16 w16cex w16sdtdh w16sdtfl w16du wp14">
+  <w:abstractNum w:abstractNumId="0" w15:restartNumberingAfterBreak="0">
+    <w:nsid w:val="2F07677C"/>
+    <w:multiLevelType w:val="hybridMultilevel"/>
+    <w:tmpl w:val="23F0070E"/>
+    <w:lvl w:ilvl="0" w:tplc="0409000F">
+      <w:start w:val="1"/>
+      <w:numFmt w:val="decimal"/>
+      <w:lvlText w:val="%1."/>
+      <w:lvlJc w:val="left"/>
+      <w:pPr>
+        <w:ind w:left="480" w:hanging="480"/>
+      </w:pPr>
+    </w:lvl>
+    <w:lvl w:ilvl="1" w:tplc="04090019" w:tentative="1">
+      <w:start w:val="1"/>
+      <w:numFmt w:val="ideographTraditional"/>
+      <w:lvlText w:val="%2、"/>
+      <w:lvlJc w:val="left"/>
+      <w:pPr>
+        <w:ind w:left="960" w:hanging="480"/>
+      </w:pPr>
+    </w:lvl>
+    <w:lvl w:ilvl="2" w:tplc="0409001B" w:tentative="1">
+      <w:start w:val="1"/>
+      <w:numFmt w:val="lowerRoman"/>
+      <w:lvlText w:val="%3."/>
+      <w:lvlJc w:val="right"/>
+      <w:pPr>
+        <w:ind w:left="1440" w:hanging="480"/>
+      </w:pPr>
+    </w:lvl>
+    <w:lvl w:ilvl="3" w:tplc="0409000F" w:tentative="1">
+      <w:start w:val="1"/>
+      <w:numFmt w:val="decimal"/>
+      <w:lvlText w:val="%4."/>
+      <w:lvlJc w:val="left"/>
+      <w:pPr>
+        <w:ind w:left="1920" w:hanging="480"/>
+      </w:pPr>
+    </w:lvl>
+    <w:lvl w:ilvl="4" w:tplc="04090019" w:tentative="1">
+      <w:start w:val="1"/>
+      <w:numFmt w:val="ideographTraditional"/>
+      <w:lvlText w:val="%5、"/>
+      <w:lvlJc w:val="left"/>
+      <w:pPr>
+        <w:ind w:left="2400" w:hanging="480"/>
+      </w:pPr>
+    </w:lvl>
+    <w:lvl w:ilvl="5" w:tplc="0409001B" w:tentative="1">
+      <w:start w:val="1"/>
+      <w:numFmt w:val="lowerRoman"/>
+      <w:lvlText w:val="%6."/>
+      <w:lvlJc w:val="right"/>
+      <w:pPr>
+        <w:ind w:left="2880" w:hanging="480"/>
+      </w:pPr>
+    </w:lvl>
+    <w:lvl w:ilvl="6" w:tplc="0409000F" w:tentative="1">
+      <w:start w:val="1"/>
+      <w:numFmt w:val="decimal"/>
+      <w:lvlText w:val="%7."/>
+      <w:lvlJc w:val="left"/>
+      <w:pPr>
+        <w:ind w:left="3360" w:hanging="480"/>
+      </w:pPr>
+    </w:lvl>
+    <w:lvl w:ilvl="7" w:tplc="04090019" w:tentative="1">
+      <w:start w:val="1"/>
+      <w:numFmt w:val="ideographTraditional"/>
+      <w:lvlText w:val="%8、"/>
+      <w:lvlJc w:val="left"/>
+      <w:pPr>
+        <w:ind w:left="3840" w:hanging="480"/>
+      </w:pPr>
+    </w:lvl>
+    <w:lvl w:ilvl="8" w:tplc="0409001B" w:tentative="1">
+      <w:start w:val="1"/>
+      <w:numFmt w:val="lowerRoman"/>
+      <w:lvlText w:val="%9."/>
+      <w:lvlJc w:val="right"/>
+      <w:pPr>
+        <w:ind w:left="4320" w:hanging="480"/>
+      </w:pPr>
+    </w:lvl>
+  </w:abstractNum>
+  <w:num w:numId="1" w16cid:durableId="747382840">
+    <w:abstractNumId w:val="0"/>
+  </w:num>
+</w:numbering>
 </file>
 
 <file path=word/styles.xml><?xml version="1.0" encoding="utf-8"?>
@@ -956,6 +1771,89 @@
       <w:spacing w:val="5"/>
     </w:rPr>
   </w:style>
+  <w:style w:type="character" w:styleId="ae">
+    <w:name w:val="Hyperlink"/>
+    <w:basedOn w:val="a0"/>
+    <w:uiPriority w:val="99"/>
+    <w:unhideWhenUsed/>
+    <w:rsid w:val="00275C49"/>
+    <w:rPr>
+      <w:color w:val="467886" w:themeColor="hyperlink"/>
+      <w:u w:val="single"/>
+    </w:rPr>
+  </w:style>
+  <w:style w:type="character" w:styleId="af">
+    <w:name w:val="Unresolved Mention"/>
+    <w:basedOn w:val="a0"/>
+    <w:uiPriority w:val="99"/>
+    <w:semiHidden/>
+    <w:unhideWhenUsed/>
+    <w:rsid w:val="00275C49"/>
+    <w:rPr>
+      <w:color w:val="605E5C"/>
+      <w:shd w:val="clear" w:color="auto" w:fill="E1DFDD"/>
+    </w:rPr>
+  </w:style>
+  <w:style w:type="paragraph" w:styleId="af0">
+    <w:name w:val="header"/>
+    <w:basedOn w:val="a"/>
+    <w:link w:val="af1"/>
+    <w:uiPriority w:val="99"/>
+    <w:unhideWhenUsed/>
+    <w:rsid w:val="006F0EFB"/>
+    <w:pPr>
+      <w:tabs>
+        <w:tab w:val="center" w:pos="4153"/>
+        <w:tab w:val="right" w:pos="8306"/>
+      </w:tabs>
+      <w:snapToGrid w:val="0"/>
+    </w:pPr>
+    <w:rPr>
+      <w:sz w:val="20"/>
+      <w:szCs w:val="20"/>
+    </w:rPr>
+  </w:style>
+  <w:style w:type="character" w:customStyle="1" w:styleId="af1">
+    <w:name w:val="頁首 字元"/>
+    <w:basedOn w:val="a0"/>
+    <w:link w:val="af0"/>
+    <w:uiPriority w:val="99"/>
+    <w:rsid w:val="006F0EFB"/>
+    <w:rPr>
+      <w:sz w:val="20"/>
+      <w:szCs w:val="20"/>
+    </w:rPr>
+  </w:style>
+  <w:style w:type="paragraph" w:styleId="af2">
+    <w:name w:val="footer"/>
+    <w:basedOn w:val="a"/>
+    <w:link w:val="af3"/>
+    <w:uiPriority w:val="99"/>
+    <w:unhideWhenUsed/>
+    <w:rsid w:val="006F0EFB"/>
+    <w:pPr>
+      <w:tabs>
+        <w:tab w:val="center" w:pos="4153"/>
+        <w:tab w:val="right" w:pos="8306"/>
+      </w:tabs>
+      <w:snapToGrid w:val="0"/>
+    </w:pPr>
+    <w:rPr>
+      <w:sz w:val="20"/>
+      <w:szCs w:val="20"/>
+    </w:rPr>
+  </w:style>
+  <w:style w:type="character" w:customStyle="1" w:styleId="af3">
+    <w:name w:val="頁尾 字元"/>
+    <w:basedOn w:val="a0"/>
+    <w:link w:val="af2"/>
+    <w:uiPriority w:val="99"/>
+    <w:rsid w:val="006F0EFB"/>
+    <w:rPr>
+      <w:sz w:val="20"/>
+      <w:szCs w:val="20"/>
+    </w:rPr>
+  </w:style>
 </w:styles>
 </file>
 

</xml_diff>

<commit_message>
edit  files work with new Folder Structure2
also fixed :  shell: /usr/bin/bash -e {0}
  env:
    pythonLocation: /opt/hostedtoolcache/Python/3.11.11/x64
    LD_LIBRARY_PATH: /opt/hostedtoolcache/Python/3.11.11/x64/lib
./Main.py:819:5: F824 `global WINDOW_SIZE` is unused: name is never assigned in scope
    global WINDOW_SIZE
    ^
./Unit Test/test_game.py:665:17: F824 `nonlocal drawn_cards` is unused: name is never assigned in scope
                nonlocal drawn_cards
                ^
2     F824 `global WINDOW_SIZE` is unused: name is never assigned in scope
2
</commit_message>
<xml_diff>
--- a/6.Testing evidence/Testing documentation.docx
+++ b/6.Testing evidence/Testing documentation.docx
@@ -237,7 +237,19 @@
         <w:rPr>
           <w:rFonts w:ascii="BritishRailDarkNormal" w:hAnsi="BritishRailDarkNormal" w:cs="Arial"/>
         </w:rPr>
-        <w:t xml:space="preserve">unit test with 32 test </w:t>
+        <w:t xml:space="preserve">unit test with </w:t>
+      </w:r>
+      <w:r>
+        <w:rPr>
+          <w:rFonts w:ascii="BritishRailDarkNormal" w:hAnsi="BritishRailDarkNormal" w:cs="Arial" w:hint="eastAsia"/>
+        </w:rPr>
+        <w:t>43</w:t>
+      </w:r>
+      <w:r>
+        <w:rPr>
+          <w:rFonts w:ascii="BritishRailDarkNormal" w:hAnsi="BritishRailDarkNormal" w:cs="Arial"/>
+        </w:rPr>
+        <w:t xml:space="preserve"> test </w:t>
       </w:r>
       <w:r>
         <w:rPr>
@@ -311,7 +323,7 @@
         <w:pStyle w:val="a9"/>
         <w:ind w:left="480"/>
         <w:rPr>
-          <w:rFonts w:ascii="BritishRailDarkNormal" w:hAnsi="BritishRailDarkNormal" w:cs="Arial" w:hint="eastAsia"/>
+          <w:rFonts w:ascii="BritishRailDarkNormal" w:hAnsi="BritishRailDarkNormal" w:cs="Arial"/>
         </w:rPr>
       </w:pPr>
       <w:r>

</xml_diff>

<commit_message>
try Deploy Documentation to github Pages
</commit_message>
<xml_diff>
--- a/6.Testing evidence/Testing documentation.docx
+++ b/6.Testing evidence/Testing documentation.docx
@@ -8,6 +8,13 @@
           <w:rFonts w:ascii="BritishRailDarkNormal" w:hAnsi="BritishRailDarkNormal" w:cs="Arial"/>
         </w:rPr>
       </w:pPr>
+    </w:p>
+    <w:p>
+      <w:pPr>
+        <w:rPr>
+          <w:rFonts w:ascii="BritishRailDarkNormal" w:hAnsi="BritishRailDarkNormal" w:cs="Arial"/>
+        </w:rPr>
+      </w:pPr>
       <w:r>
         <w:rPr>
           <w:rFonts w:ascii="BritishRailDarkNormal" w:hAnsi="BritishRailDarkNormal" w:cs="Arial"/>
@@ -357,6 +364,30 @@
     <w:p>
       <w:pPr>
         <w:pStyle w:val="a9"/>
+        <w:ind w:left="480"/>
+        <w:rPr>
+          <w:rFonts w:ascii="BritishRailDarkNormal" w:hAnsi="BritishRailDarkNormal" w:cs="Arial"/>
+        </w:rPr>
+      </w:pPr>
+    </w:p>
+    <w:p>
+      <w:pPr>
+        <w:pStyle w:val="a9"/>
+        <w:ind w:left="480"/>
+        <w:rPr>
+          <w:rFonts w:ascii="BritishRailDarkNormal" w:hAnsi="BritishRailDarkNormal" w:cs="Arial" w:hint="eastAsia"/>
+        </w:rPr>
+      </w:pPr>
+      <w:r>
+        <w:rPr>
+          <w:rFonts w:ascii="BritishRailDarkNormal" w:hAnsi="BritishRailDarkNormal" w:cs="Arial"/>
+        </w:rPr>
+        <w:t xml:space="preserve">card and property late one-round show bug </w:t>
+      </w:r>
+    </w:p>
+    <w:p>
+      <w:pPr>
+        <w:pStyle w:val="a9"/>
         <w:numPr>
           <w:ilvl w:val="0"/>
           <w:numId w:val="1"/>
@@ -435,6 +466,7 @@
         <w:rPr>
           <w:rFonts w:ascii="BritishRailDarkNormal" w:hAnsi="BritishRailDarkNormal" w:cs="Arial"/>
         </w:rPr>
+        <w:lastRenderedPageBreak/>
         <w:t>found</w:t>
       </w:r>
       <w:r>
@@ -630,12 +662,14 @@
         </w:rPr>
         <w:t xml:space="preserve">  </w:t>
       </w:r>
+      <w:proofErr w:type="spellStart"/>
       <w:r>
         <w:rPr>
           <w:rFonts w:ascii="BritishRailDarkNormal" w:hAnsi="BritishRailDarkNormal" w:cs="Arial"/>
         </w:rPr>
         <w:t>Github</w:t>
       </w:r>
+      <w:proofErr w:type="spellEnd"/>
     </w:p>
     <w:p>
       <w:pPr>
@@ -703,7 +737,21 @@
         <w:rPr>
           <w:rFonts w:ascii="BritishRailDarkNormal" w:hAnsi="BritishRailDarkNormal" w:cs="Arial"/>
         </w:rPr>
-        <w:t xml:space="preserve">python-package.yml </w:t>
+        <w:t>python-</w:t>
+      </w:r>
+      <w:proofErr w:type="spellStart"/>
+      <w:r>
+        <w:rPr>
+          <w:rFonts w:ascii="BritishRailDarkNormal" w:hAnsi="BritishRailDarkNormal" w:cs="Arial"/>
+        </w:rPr>
+        <w:t>package.yml</w:t>
+      </w:r>
+      <w:proofErr w:type="spellEnd"/>
+      <w:r>
+        <w:rPr>
+          <w:rFonts w:ascii="BritishRailDarkNormal" w:hAnsi="BritishRailDarkNormal" w:cs="Arial"/>
+        </w:rPr>
+        <w:t xml:space="preserve"> </w:t>
       </w:r>
       <w:r>
         <w:rPr>
@@ -1471,7 +1519,6 @@
   <w:style w:type="character" w:default="1" w:styleId="a0">
     <w:name w:val="Default Paragraph Font"/>
     <w:uiPriority w:val="1"/>
-    <w:semiHidden/>
     <w:unhideWhenUsed/>
   </w:style>
   <w:style w:type="table" w:default="1" w:styleId="a1">

</xml_diff>